<commit_message>
QS-Arbeitsliste: Punkt von AIDA ergaenzt (Einschulung neuen Personals)
Co-Authored-By: Claude Sonnet 5 <noreply@anthropic.com>
Claude-Session: https://claude.ai/code/session_01KTGUGVaPm39C5Y3H1dpETj
</commit_message>
<xml_diff>
--- a/working/QS_Rollenbeschreibung_Arbeitsentwurf.docx
+++ b/working/QS_Rollenbeschreibung_Arbeitsentwurf.docx
@@ -248,6 +248,22 @@
           <w:rFonts w:ascii="Calibri" w:cs="Calibri" w:eastAsia="Calibri" w:hAnsi="Calibri"/>
         </w:rPr>
         <w:t xml:space="preserve">Einbindung bei multidisziplinären, automatisierungsbedingten Prozessänderungen</w:t>
+      </w:r>
+    </w:p>
+    <w:p>
+      <w:pPr>
+        <w:pStyle w:val="ListParagraph"/>
+        <w:numPr>
+          <w:ilvl w:val="0"/>
+          <w:numId w:val="2"/>
+        </w:numPr>
+        <w:spacing w:after="100"/>
+      </w:pPr>
+      <w:r>
+        <w:rPr>
+          <w:rFonts w:ascii="Calibri" w:cs="Calibri" w:eastAsia="Calibri" w:hAnsi="Calibri"/>
+        </w:rPr>
+        <w:t xml:space="preserve">Kontrolle, Unterstützung und Einschulung neuen Personals (Qualitätsthemen)</w:t>
       </w:r>
     </w:p>
     <w:p>

</xml_diff>

<commit_message>
QS-Arbeitsliste: Punkt von AIDA ergaenzt (Kontrolle laufender Auftraege)
Co-Authored-By: Claude Sonnet 5 <noreply@anthropic.com>
Claude-Session: https://claude.ai/code/session_01KTGUGVaPm39C5Y3H1dpETj
</commit_message>
<xml_diff>
--- a/working/QS_Rollenbeschreibung_Arbeitsentwurf.docx
+++ b/working/QS_Rollenbeschreibung_Arbeitsentwurf.docx
@@ -264,6 +264,22 @@
           <w:rFonts w:ascii="Calibri" w:cs="Calibri" w:eastAsia="Calibri" w:hAnsi="Calibri"/>
         </w:rPr>
         <w:t xml:space="preserve">Kontrolle, Unterstützung und Einschulung neuen Personals (Qualitätsthemen)</w:t>
+      </w:r>
+    </w:p>
+    <w:p>
+      <w:pPr>
+        <w:pStyle w:val="ListParagraph"/>
+        <w:numPr>
+          <w:ilvl w:val="0"/>
+          <w:numId w:val="2"/>
+        </w:numPr>
+        <w:spacing w:after="100"/>
+      </w:pPr>
+      <w:r>
+        <w:rPr>
+          <w:rFonts w:ascii="Calibri" w:cs="Calibri" w:eastAsia="Calibri" w:hAnsi="Calibri"/>
+        </w:rPr>
+        <w:t xml:space="preserve">Kontrolle aller laufenden Aufträge: Teile- und Maschinenzustand, Ausschussquote, korrekte Ausschuss-Trennung direkt an der Maschine, korrekte Buchungen, ordnungsgemäße Auftragsvorbereitung (Erststück, Rückstellmuster, vollständig ausgefüllte Dokumente, gekennzeichnete Ausschussbehälter)</w:t>
       </w:r>
     </w:p>
     <w:p>

</xml_diff>

<commit_message>
QS-Arbeitsliste: Punkt von AIDA ergaenzt (Gebinde-Kontrolle)
Co-Authored-By: Claude Sonnet 5 <noreply@anthropic.com>
Claude-Session: https://claude.ai/code/session_01KTGUGVaPm39C5Y3H1dpETj
</commit_message>
<xml_diff>
--- a/working/QS_Rollenbeschreibung_Arbeitsentwurf.docx
+++ b/working/QS_Rollenbeschreibung_Arbeitsentwurf.docx
@@ -280,6 +280,22 @@
           <w:rFonts w:ascii="Calibri" w:cs="Calibri" w:eastAsia="Calibri" w:hAnsi="Calibri"/>
         </w:rPr>
         <w:t xml:space="preserve">Kontrolle aller laufenden Aufträge: Teile- und Maschinenzustand, Ausschussquote, korrekte Ausschuss-Trennung direkt an der Maschine, korrekte Buchungen, ordnungsgemäße Auftragsvorbereitung (Erststück, Rückstellmuster, vollständig ausgefüllte Dokumente, gekennzeichnete Ausschussbehälter)</w:t>
+      </w:r>
+    </w:p>
+    <w:p>
+      <w:pPr>
+        <w:pStyle w:val="ListParagraph"/>
+        <w:numPr>
+          <w:ilvl w:val="0"/>
+          <w:numId w:val="2"/>
+        </w:numPr>
+        <w:spacing w:after="100"/>
+      </w:pPr>
+      <w:r>
+        <w:rPr>
+          <w:rFonts w:ascii="Calibri" w:cs="Calibri" w:eastAsia="Calibri" w:hAnsi="Calibri"/>
+        </w:rPr>
+        <w:t xml:space="preserve">Kontrolle, ob alle Gebinde (interne Gebinde oder Ausliefergebinde) korrekt laut Auftrag vorbereitet, gebucht und bezettelt sind</w:t>
       </w:r>
     </w:p>
     <w:p>

</xml_diff>

<commit_message>
QS-Arbeitsliste: Punkt von AIDA ergaenzt (Arbeitsanweisungen/Verpackungsvorschriften am mobilen PC)
Co-Authored-By: Claude Sonnet 5 <noreply@anthropic.com>
Claude-Session: https://claude.ai/code/session_01KTGUGVaPm39C5Y3H1dpETj
</commit_message>
<xml_diff>
--- a/working/QS_Rollenbeschreibung_Arbeitsentwurf.docx
+++ b/working/QS_Rollenbeschreibung_Arbeitsentwurf.docx
@@ -296,6 +296,22 @@
           <w:rFonts w:ascii="Calibri" w:cs="Calibri" w:eastAsia="Calibri" w:hAnsi="Calibri"/>
         </w:rPr>
         <w:t xml:space="preserve">Kontrolle, ob alle Gebinde (interne Gebinde oder Ausliefergebinde) korrekt laut Auftrag vorbereitet, gebucht und bezettelt sind</w:t>
+      </w:r>
+    </w:p>
+    <w:p>
+      <w:pPr>
+        <w:pStyle w:val="ListParagraph"/>
+        <w:numPr>
+          <w:ilvl w:val="0"/>
+          <w:numId w:val="2"/>
+        </w:numPr>
+        <w:spacing w:after="100"/>
+      </w:pPr>
+      <w:r>
+        <w:rPr>
+          <w:rFonts w:ascii="Calibri" w:cs="Calibri" w:eastAsia="Calibri" w:hAnsi="Calibri"/>
+        </w:rPr>
+        <w:t xml:space="preserve">Kontrolle, ob Arbeitsanweisungen und Verpackungsvorschriften am mobilen PC geöffnet/verfügbar sind</w:t>
       </w:r>
     </w:p>
     <w:p>

</xml_diff>

<commit_message>
QS-Arbeitsliste: Punkt von AIDA ergaenzt (Pruefung der Anweisungen auf Aktualitaet)
Co-Authored-By: Claude Sonnet 5 <noreply@anthropic.com>
Claude-Session: https://claude.ai/code/session_01KTGUGVaPm39C5Y3H1dpETj
</commit_message>
<xml_diff>
--- a/working/QS_Rollenbeschreibung_Arbeitsentwurf.docx
+++ b/working/QS_Rollenbeschreibung_Arbeitsentwurf.docx
@@ -312,6 +312,22 @@
           <w:rFonts w:ascii="Calibri" w:cs="Calibri" w:eastAsia="Calibri" w:hAnsi="Calibri"/>
         </w:rPr>
         <w:t xml:space="preserve">Kontrolle, ob Arbeitsanweisungen und Verpackungsvorschriften am mobilen PC geöffnet/verfügbar sind</w:t>
+      </w:r>
+    </w:p>
+    <w:p>
+      <w:pPr>
+        <w:pStyle w:val="ListParagraph"/>
+        <w:numPr>
+          <w:ilvl w:val="0"/>
+          <w:numId w:val="2"/>
+        </w:numPr>
+        <w:spacing w:after="100"/>
+      </w:pPr>
+      <w:r>
+        <w:rPr>
+          <w:rFonts w:ascii="Calibri" w:cs="Calibri" w:eastAsia="Calibri" w:hAnsi="Calibri"/>
+        </w:rPr>
+        <w:t xml:space="preserve">Prüfung der Anweisungen auf Aktualität (hat sich im Prozess etwas geändert?)</w:t>
       </w:r>
     </w:p>
     <w:p>

</xml_diff>

<commit_message>
QS-Arbeitsliste: Punkt von AIDA ergaenzt (Auffaelligkeiten/Werkzeugthemen)
Co-Authored-By: Claude Sonnet 5 <noreply@anthropic.com>
Claude-Session: https://claude.ai/code/session_01KTGUGVaPm39C5Y3H1dpETj
</commit_message>
<xml_diff>
--- a/working/QS_Rollenbeschreibung_Arbeitsentwurf.docx
+++ b/working/QS_Rollenbeschreibung_Arbeitsentwurf.docx
@@ -328,6 +328,22 @@
           <w:rFonts w:ascii="Calibri" w:cs="Calibri" w:eastAsia="Calibri" w:hAnsi="Calibri"/>
         </w:rPr>
         <w:t xml:space="preserve">Prüfung der Anweisungen auf Aktualität (hat sich im Prozess etwas geändert?)</w:t>
+      </w:r>
+    </w:p>
+    <w:p>
+      <w:pPr>
+        <w:pStyle w:val="ListParagraph"/>
+        <w:numPr>
+          <w:ilvl w:val="0"/>
+          <w:numId w:val="2"/>
+        </w:numPr>
+        <w:spacing w:after="100"/>
+      </w:pPr>
+      <w:r>
+        <w:rPr>
+          <w:rFonts w:ascii="Calibri" w:cs="Calibri" w:eastAsia="Calibri" w:hAnsi="Calibri"/>
+        </w:rPr>
+        <w:t xml:space="preserve">Kontrolle von Auffälligkeiten bei den Bauteilen; Besprechung von Werkzeugthemen (z. B. notwendige Reparaturen wie Grate, Verschmutzungen, Spritzprobleme) mit Schichtführer/Einsteller/Rüster und bei Bedarf mit Werkzeugbau</w:t>
       </w:r>
     </w:p>
     <w:p>

</xml_diff>

<commit_message>
QS-Arbeitsliste: Punkt von AIDA ergaenzt (FGA-Festlegung nach Werkzeugwartung/-reparatur)
Co-Authored-By: Claude Sonnet 5 <noreply@anthropic.com>
Claude-Session: https://claude.ai/code/session_01KTGUGVaPm39C5Y3H1dpETj
</commit_message>
<xml_diff>
--- a/working/QS_Rollenbeschreibung_Arbeitsentwurf.docx
+++ b/working/QS_Rollenbeschreibung_Arbeitsentwurf.docx
@@ -344,6 +344,22 @@
           <w:rFonts w:ascii="Calibri" w:cs="Calibri" w:eastAsia="Calibri" w:hAnsi="Calibri"/>
         </w:rPr>
         <w:t xml:space="preserve">Kontrolle von Auffälligkeiten bei den Bauteilen; Besprechung von Werkzeugthemen (z. B. notwendige Reparaturen wie Grate, Verschmutzungen, Spritzprobleme) mit Schichtführer/Einsteller/Rüster und bei Bedarf mit Werkzeugbau</w:t>
+      </w:r>
+    </w:p>
+    <w:p>
+      <w:pPr>
+        <w:pStyle w:val="ListParagraph"/>
+        <w:numPr>
+          <w:ilvl w:val="0"/>
+          <w:numId w:val="2"/>
+        </w:numPr>
+        <w:spacing w:after="100"/>
+      </w:pPr>
+      <w:r>
+        <w:rPr>
+          <w:rFonts w:ascii="Calibri" w:cs="Calibri" w:eastAsia="Calibri" w:hAnsi="Calibri"/>
+        </w:rPr>
+        <w:t xml:space="preserve">Festlegung von FGAs (Freigabeauftrag) nach Werkzeugwartung/-reparatur aufgrund von Qualitätsthemen</w:t>
       </w:r>
     </w:p>
     <w:p>

</xml_diff>

<commit_message>
QS-Arbeitsliste: Punkt von AIDA ergaenzt (Schichtlogbuch-Kontrolle)
Co-Authored-By: Claude Sonnet 5 <noreply@anthropic.com>
Claude-Session: https://claude.ai/code/session_01KTGUGVaPm39C5Y3H1dpETj
</commit_message>
<xml_diff>
--- a/working/QS_Rollenbeschreibung_Arbeitsentwurf.docx
+++ b/working/QS_Rollenbeschreibung_Arbeitsentwurf.docx
@@ -360,6 +360,22 @@
           <w:rFonts w:ascii="Calibri" w:cs="Calibri" w:eastAsia="Calibri" w:hAnsi="Calibri"/>
         </w:rPr>
         <w:t xml:space="preserve">Festlegung von FGAs (Freigabeauftrag) nach Werkzeugwartung/-reparatur aufgrund von Qualitätsthemen</w:t>
+      </w:r>
+    </w:p>
+    <w:p>
+      <w:pPr>
+        <w:pStyle w:val="ListParagraph"/>
+        <w:numPr>
+          <w:ilvl w:val="0"/>
+          <w:numId w:val="2"/>
+        </w:numPr>
+        <w:spacing w:after="100"/>
+      </w:pPr>
+      <w:r>
+        <w:rPr>
+          <w:rFonts w:ascii="Calibri" w:cs="Calibri" w:eastAsia="Calibri" w:hAnsi="Calibri"/>
+        </w:rPr>
+        <w:t xml:space="preserve">Kontrolle des Schichtlogbuchs auf Vollständigkeit (inkl. Vorkommnisse der 2. und 3. Schicht); Kontrolle der PQB-Einträge und der Schichtführer-Einträge</w:t>
       </w:r>
     </w:p>
     <w:p>

</xml_diff>

<commit_message>
QS-Arbeitsliste: Punkt von AIDA ergaenzt (Personal-Maschinen-Zuordnung)
Co-Authored-By: Claude Sonnet 5 <noreply@anthropic.com>
Claude-Session: https://claude.ai/code/session_01KTGUGVaPm39C5Y3H1dpETj
</commit_message>
<xml_diff>
--- a/working/QS_Rollenbeschreibung_Arbeitsentwurf.docx
+++ b/working/QS_Rollenbeschreibung_Arbeitsentwurf.docx
@@ -376,6 +376,22 @@
           <w:rFonts w:ascii="Calibri" w:cs="Calibri" w:eastAsia="Calibri" w:hAnsi="Calibri"/>
         </w:rPr>
         <w:t xml:space="preserve">Kontrolle des Schichtlogbuchs auf Vollständigkeit (inkl. Vorkommnisse der 2. und 3. Schicht); Kontrolle der PQB-Einträge und der Schichtführer-Einträge</w:t>
+      </w:r>
+    </w:p>
+    <w:p>
+      <w:pPr>
+        <w:pStyle w:val="ListParagraph"/>
+        <w:numPr>
+          <w:ilvl w:val="0"/>
+          <w:numId w:val="2"/>
+        </w:numPr>
+        <w:spacing w:after="100"/>
+      </w:pPr>
+      <w:r>
+        <w:rPr>
+          <w:rFonts w:ascii="Calibri" w:cs="Calibri" w:eastAsia="Calibri" w:hAnsi="Calibri"/>
+        </w:rPr>
+        <w:t xml:space="preserve">Überblick über die Zuordnung des Personals zu den Maschinen, um den bestmöglichen Einsatz (Qualifikation und Produktivität) mit zu beurteilen</w:t>
       </w:r>
     </w:p>
     <w:p>

</xml_diff>

<commit_message>
QS-Arbeitsliste: Punkt von AIDA ergaenzt (taeglicher Ausschussbericht)
Co-Authored-By: Claude Sonnet 5 <noreply@anthropic.com>
Claude-Session: https://claude.ai/code/session_01KTGUGVaPm39C5Y3H1dpETj
</commit_message>
<xml_diff>
--- a/working/QS_Rollenbeschreibung_Arbeitsentwurf.docx
+++ b/working/QS_Rollenbeschreibung_Arbeitsentwurf.docx
@@ -392,6 +392,22 @@
           <w:rFonts w:ascii="Calibri" w:cs="Calibri" w:eastAsia="Calibri" w:hAnsi="Calibri"/>
         </w:rPr>
         <w:t xml:space="preserve">Überblick über die Zuordnung des Personals zu den Maschinen, um den bestmöglichen Einsatz (Qualifikation und Produktivität) mit zu beurteilen</w:t>
+      </w:r>
+    </w:p>
+    <w:p>
+      <w:pPr>
+        <w:pStyle w:val="ListParagraph"/>
+        <w:numPr>
+          <w:ilvl w:val="0"/>
+          <w:numId w:val="2"/>
+        </w:numPr>
+        <w:spacing w:after="100"/>
+      </w:pPr>
+      <w:r>
+        <w:rPr>
+          <w:rFonts w:ascii="Calibri" w:cs="Calibri" w:eastAsia="Calibri" w:hAnsi="Calibri"/>
+        </w:rPr>
+        <w:t xml:space="preserve">Durchsicht des täglichen Ausschussberichts je Auftrag/Bauteil</w:t>
       </w:r>
     </w:p>
     <w:p>

</xml_diff>

<commit_message>
QS-Arbeitsliste: Punkt von AIDA ergaenzt (Buchungscode-Kontrolle)
Co-Authored-By: Claude Sonnet 5 <noreply@anthropic.com>
Claude-Session: https://claude.ai/code/session_01KTGUGVaPm39C5Y3H1dpETj
</commit_message>
<xml_diff>
--- a/working/QS_Rollenbeschreibung_Arbeitsentwurf.docx
+++ b/working/QS_Rollenbeschreibung_Arbeitsentwurf.docx
@@ -408,6 +408,22 @@
           <w:rFonts w:ascii="Calibri" w:cs="Calibri" w:eastAsia="Calibri" w:hAnsi="Calibri"/>
         </w:rPr>
         <w:t xml:space="preserve">Durchsicht des täglichen Ausschussberichts je Auftrag/Bauteil</w:t>
+      </w:r>
+    </w:p>
+    <w:p>
+      <w:pPr>
+        <w:pStyle w:val="ListParagraph"/>
+        <w:numPr>
+          <w:ilvl w:val="0"/>
+          <w:numId w:val="2"/>
+        </w:numPr>
+        <w:spacing w:after="100"/>
+      </w:pPr>
+      <w:r>
+        <w:rPr>
+          <w:rFonts w:ascii="Calibri" w:cs="Calibri" w:eastAsia="Calibri" w:hAnsi="Calibri"/>
+        </w:rPr>
+        <w:t xml:space="preserve">Kontrolle und Verifizierung der Buchungscodes auf Korrektheit; bei Auffälligkeiten Rückfrage und Korrektur</w:t>
       </w:r>
     </w:p>
     <w:p>

</xml_diff>

<commit_message>
QS-Arbeitsliste: Punkt von AIDA ergaenzt (Sperrlager-Kontrolle)
Co-Authored-By: Claude Sonnet 5 <noreply@anthropic.com>
Claude-Session: https://claude.ai/code/session_01KTGUGVaPm39C5Y3H1dpETj
</commit_message>
<xml_diff>
--- a/working/QS_Rollenbeschreibung_Arbeitsentwurf.docx
+++ b/working/QS_Rollenbeschreibung_Arbeitsentwurf.docx
@@ -424,6 +424,22 @@
           <w:rFonts w:ascii="Calibri" w:cs="Calibri" w:eastAsia="Calibri" w:hAnsi="Calibri"/>
         </w:rPr>
         <w:t xml:space="preserve">Kontrolle und Verifizierung der Buchungscodes auf Korrektheit; bei Auffälligkeiten Rückfrage und Korrektur</w:t>
+      </w:r>
+    </w:p>
+    <w:p>
+      <w:pPr>
+        <w:pStyle w:val="ListParagraph"/>
+        <w:numPr>
+          <w:ilvl w:val="0"/>
+          <w:numId w:val="2"/>
+        </w:numPr>
+        <w:spacing w:after="100"/>
+      </w:pPr>
+      <w:r>
+        <w:rPr>
+          <w:rFonts w:ascii="Calibri" w:cs="Calibri" w:eastAsia="Calibri" w:hAnsi="Calibri"/>
+        </w:rPr>
+        <w:t xml:space="preserve">Kontrolle des Bestands und der Abarbeitung des Sperrlagers (NA-Aufträge)</w:t>
       </w:r>
     </w:p>
     <w:p>

</xml_diff>

<commit_message>
QS-Arbeitsliste: Punkt von AIDA ergaenzt (Nacharbeit-Organisation mit PPS), NA praezisiert
Co-Authored-By: Claude Sonnet 5 <noreply@anthropic.com>
Claude-Session: https://claude.ai/code/session_01KTGUGVaPm39C5Y3H1dpETj
</commit_message>
<xml_diff>
--- a/working/QS_Rollenbeschreibung_Arbeitsentwurf.docx
+++ b/working/QS_Rollenbeschreibung_Arbeitsentwurf.docx
@@ -439,7 +439,23 @@
         <w:rPr>
           <w:rFonts w:ascii="Calibri" w:cs="Calibri" w:eastAsia="Calibri" w:hAnsi="Calibri"/>
         </w:rPr>
-        <w:t xml:space="preserve">Kontrolle des Bestands und der Abarbeitung des Sperrlagers (NA-Aufträge)</w:t>
+        <w:t xml:space="preserve">Kontrolle des Bestands und der Abarbeitung des Sperrlagers (Nacharbeits-Aufträge)</w:t>
+      </w:r>
+    </w:p>
+    <w:p>
+      <w:pPr>
+        <w:pStyle w:val="ListParagraph"/>
+        <w:numPr>
+          <w:ilvl w:val="0"/>
+          <w:numId w:val="2"/>
+        </w:numPr>
+        <w:spacing w:after="100"/>
+      </w:pPr>
+      <w:r>
+        <w:rPr>
+          <w:rFonts w:ascii="Calibri" w:cs="Calibri" w:eastAsia="Calibri" w:hAnsi="Calibri"/>
+        </w:rPr>
+        <w:t xml:space="preserve">Organisation der erforderlichen Nacharbeit in Abstimmung mit der Produktionsplanung und -steuerung (PPS) bzgl. verfügbarem Personal</w:t>
       </w:r>
     </w:p>
     <w:p>

</xml_diff>

<commit_message>
QS-Arbeitsliste: Punkt von AIDA ergaenzt (Rueckstellmusterkontrolle)
Co-Authored-By: Claude Sonnet 5 <noreply@anthropic.com>
Claude-Session: https://claude.ai/code/session_01KTGUGVaPm39C5Y3H1dpETj
</commit_message>
<xml_diff>
--- a/working/QS_Rollenbeschreibung_Arbeitsentwurf.docx
+++ b/working/QS_Rollenbeschreibung_Arbeitsentwurf.docx
@@ -456,6 +456,22 @@
           <w:rFonts w:ascii="Calibri" w:cs="Calibri" w:eastAsia="Calibri" w:hAnsi="Calibri"/>
         </w:rPr>
         <w:t xml:space="preserve">Organisation der erforderlichen Nacharbeit in Abstimmung mit der Produktionsplanung und -steuerung (PPS) bzgl. verfügbarem Personal</w:t>
+      </w:r>
+    </w:p>
+    <w:p>
+      <w:pPr>
+        <w:pStyle w:val="ListParagraph"/>
+        <w:numPr>
+          <w:ilvl w:val="0"/>
+          <w:numId w:val="2"/>
+        </w:numPr>
+        <w:spacing w:after="100"/>
+      </w:pPr>
+      <w:r>
+        <w:rPr>
+          <w:rFonts w:ascii="Calibri" w:cs="Calibri" w:eastAsia="Calibri" w:hAnsi="Calibri"/>
+        </w:rPr>
+        <w:t xml:space="preserve">Rückstellmusterkontrolle: Prüfung nach jeder abgeschlossenen Produktion, ob das Rückstellmuster (letztes Stück) den Qualitätsanforderungen entspricht — bei i. O. Ablage im RM-Regal, bei NIO Rückverfolgung des ersten Auftretens der Abweichung</w:t>
       </w:r>
     </w:p>
     <w:p>

</xml_diff>

<commit_message>
QS-Arbeitsliste: Punkt von AIDA ergaenzt (persoenliche Betreuung der PQB)
Co-Authored-By: Claude Sonnet 5 <noreply@anthropic.com>
Claude-Session: https://claude.ai/code/session_01KTGUGVaPm39C5Y3H1dpETj
</commit_message>
<xml_diff>
--- a/working/QS_Rollenbeschreibung_Arbeitsentwurf.docx
+++ b/working/QS_Rollenbeschreibung_Arbeitsentwurf.docx
@@ -472,6 +472,22 @@
           <w:rFonts w:ascii="Calibri" w:cs="Calibri" w:eastAsia="Calibri" w:hAnsi="Calibri"/>
         </w:rPr>
         <w:t xml:space="preserve">Rückstellmusterkontrolle: Prüfung nach jeder abgeschlossenen Produktion, ob das Rückstellmuster (letztes Stück) den Qualitätsanforderungen entspricht — bei i. O. Ablage im RM-Regal, bei NIO Rückverfolgung des ersten Auftretens der Abweichung</w:t>
+      </w:r>
+    </w:p>
+    <w:p>
+      <w:pPr>
+        <w:pStyle w:val="ListParagraph"/>
+        <w:numPr>
+          <w:ilvl w:val="0"/>
+          <w:numId w:val="2"/>
+        </w:numPr>
+        <w:spacing w:after="100"/>
+      </w:pPr>
+      <w:r>
+        <w:rPr>
+          <w:rFonts w:ascii="Calibri" w:cs="Calibri" w:eastAsia="Calibri" w:hAnsi="Calibri"/>
+        </w:rPr>
+        <w:t xml:space="preserve">Laufende persönliche Betreuung/Beratung der anwesenden PQB</w:t>
       </w:r>
     </w:p>
     <w:p>

</xml_diff>

<commit_message>
QS-Arbeitsliste: Punkt von AIDA ergaenzt (fachlicher Austausch vor Ort)
Co-Authored-By: Claude Sonnet 5 <noreply@anthropic.com>
Claude-Session: https://claude.ai/code/session_01KTGUGVaPm39C5Y3H1dpETj
</commit_message>
<xml_diff>
--- a/working/QS_Rollenbeschreibung_Arbeitsentwurf.docx
+++ b/working/QS_Rollenbeschreibung_Arbeitsentwurf.docx
@@ -488,6 +488,22 @@
           <w:rFonts w:ascii="Calibri" w:cs="Calibri" w:eastAsia="Calibri" w:hAnsi="Calibri"/>
         </w:rPr>
         <w:t xml:space="preserve">Laufende persönliche Betreuung/Beratung der anwesenden PQB</w:t>
+      </w:r>
+    </w:p>
+    <w:p>
+      <w:pPr>
+        <w:pStyle w:val="ListParagraph"/>
+        <w:numPr>
+          <w:ilvl w:val="0"/>
+          <w:numId w:val="2"/>
+        </w:numPr>
+        <w:spacing w:after="100"/>
+      </w:pPr>
+      <w:r>
+        <w:rPr>
+          <w:rFonts w:ascii="Calibri" w:cs="Calibri" w:eastAsia="Calibri" w:hAnsi="Calibri"/>
+        </w:rPr>
+        <w:t xml:space="preserve">Fachlicher Austausch vor Ort zu allen relevanten Tagesthemen</w:t>
       </w:r>
     </w:p>
     <w:p>

</xml_diff>

<commit_message>
QS-Arbeitsliste: Punkt von AIDA ergaenzt (Qualifikationsmatrix/MA-Schulungen)
Co-Authored-By: Claude Sonnet 5 <noreply@anthropic.com>
Claude-Session: https://claude.ai/code/session_01KTGUGVaPm39C5Y3H1dpETj
</commit_message>
<xml_diff>
--- a/working/QS_Rollenbeschreibung_Arbeitsentwurf.docx
+++ b/working/QS_Rollenbeschreibung_Arbeitsentwurf.docx
@@ -504,6 +504,22 @@
           <w:rFonts w:ascii="Calibri" w:cs="Calibri" w:eastAsia="Calibri" w:hAnsi="Calibri"/>
         </w:rPr>
         <w:t xml:space="preserve">Fachlicher Austausch vor Ort zu allen relevanten Tagesthemen</w:t>
+      </w:r>
+    </w:p>
+    <w:p>
+      <w:pPr>
+        <w:pStyle w:val="ListParagraph"/>
+        <w:numPr>
+          <w:ilvl w:val="0"/>
+          <w:numId w:val="2"/>
+        </w:numPr>
+        <w:spacing w:after="100"/>
+      </w:pPr>
+      <w:r>
+        <w:rPr>
+          <w:rFonts w:ascii="Calibri" w:cs="Calibri" w:eastAsia="Calibri" w:hAnsi="Calibri"/>
+        </w:rPr>
+        <w:t xml:space="preserve">Aktualisierung der Qualifikationsmatrix; dokumentierte Durchführung von Mitarbeiterschulungen (z. B. bei neuen Mitarbeitern oder Qualitätsproblemen)</w:t>
       </w:r>
     </w:p>
     <w:p>

</xml_diff>

<commit_message>
QS-Arbeitsliste: Punkt von AIDA ergaenzt (beratende Begleitung bei Bemusterungsauftraegen)
Co-Authored-By: Claude Sonnet 5 <noreply@anthropic.com>
Claude-Session: https://claude.ai/code/session_01KTGUGVaPm39C5Y3H1dpETj
</commit_message>
<xml_diff>
--- a/working/QS_Rollenbeschreibung_Arbeitsentwurf.docx
+++ b/working/QS_Rollenbeschreibung_Arbeitsentwurf.docx
@@ -520,6 +520,22 @@
           <w:rFonts w:ascii="Calibri" w:cs="Calibri" w:eastAsia="Calibri" w:hAnsi="Calibri"/>
         </w:rPr>
         <w:t xml:space="preserve">Aktualisierung der Qualifikationsmatrix; dokumentierte Durchführung von Mitarbeiterschulungen (z. B. bei neuen Mitarbeitern oder Qualitätsproblemen)</w:t>
+      </w:r>
+    </w:p>
+    <w:p>
+      <w:pPr>
+        <w:pStyle w:val="ListParagraph"/>
+        <w:numPr>
+          <w:ilvl w:val="0"/>
+          <w:numId w:val="2"/>
+        </w:numPr>
+        <w:spacing w:after="100"/>
+      </w:pPr>
+      <w:r>
+        <w:rPr>
+          <w:rFonts w:ascii="Calibri" w:cs="Calibri" w:eastAsia="Calibri" w:hAnsi="Calibri"/>
+        </w:rPr>
+        <w:t xml:space="preserve">Beratende Begleitung aktueller Bemusterungsaufträge gegenüber Bemusterer und Technik: Sichtung der Qualitätsanforderungen der zu bemusternden Teile und Prüfung am Bauteil</w:t>
       </w:r>
     </w:p>
     <w:p>

</xml_diff>

<commit_message>
QS-Arbeitsliste: Punkt von AIDA ergaenzt (Rueckstellmuster-Anlage im FOSS)
Co-Authored-By: Claude Sonnet 5 <noreply@anthropic.com>
Claude-Session: https://claude.ai/code/session_01KTGUGVaPm39C5Y3H1dpETj
</commit_message>
<xml_diff>
--- a/working/QS_Rollenbeschreibung_Arbeitsentwurf.docx
+++ b/working/QS_Rollenbeschreibung_Arbeitsentwurf.docx
@@ -536,6 +536,22 @@
           <w:rFonts w:ascii="Calibri" w:cs="Calibri" w:eastAsia="Calibri" w:hAnsi="Calibri"/>
         </w:rPr>
         <w:t xml:space="preserve">Beratende Begleitung aktueller Bemusterungsaufträge gegenüber Bemusterer und Technik: Sichtung der Qualitätsanforderungen der zu bemusternden Teile und Prüfung am Bauteil</w:t>
+      </w:r>
+    </w:p>
+    <w:p>
+      <w:pPr>
+        <w:pStyle w:val="ListParagraph"/>
+        <w:numPr>
+          <w:ilvl w:val="0"/>
+          <w:numId w:val="2"/>
+        </w:numPr>
+        <w:spacing w:after="100"/>
+      </w:pPr>
+      <w:r>
+        <w:rPr>
+          <w:rFonts w:ascii="Calibri" w:cs="Calibri" w:eastAsia="Calibri" w:hAnsi="Calibri"/>
+        </w:rPr>
+        <w:t xml:space="preserve">Anlage des Rückstellmusters im System (FOSS)</w:t>
       </w:r>
     </w:p>
     <w:p>

</xml_diff>

<commit_message>
QS-Arbeitsliste: Punkt von AIDA ergaenzt (Stichprobenpruefung/Bauteil-Messungen)
Co-Authored-By: Claude Sonnet 5 <noreply@anthropic.com>
Claude-Session: https://claude.ai/code/session_01KTGUGVaPm39C5Y3H1dpETj
</commit_message>
<xml_diff>
--- a/working/QS_Rollenbeschreibung_Arbeitsentwurf.docx
+++ b/working/QS_Rollenbeschreibung_Arbeitsentwurf.docx
@@ -552,6 +552,22 @@
           <w:rFonts w:ascii="Calibri" w:cs="Calibri" w:eastAsia="Calibri" w:hAnsi="Calibri"/>
         </w:rPr>
         <w:t xml:space="preserve">Anlage des Rückstellmusters im System (FOSS)</w:t>
+      </w:r>
+    </w:p>
+    <w:p>
+      <w:pPr>
+        <w:pStyle w:val="ListParagraph"/>
+        <w:numPr>
+          <w:ilvl w:val="0"/>
+          <w:numId w:val="2"/>
+        </w:numPr>
+        <w:spacing w:after="100"/>
+      </w:pPr>
+      <w:r>
+        <w:rPr>
+          <w:rFonts w:ascii="Calibri" w:cs="Calibri" w:eastAsia="Calibri" w:hAnsi="Calibri"/>
+        </w:rPr>
+        <w:t xml:space="preserve">Stichprobenprüfung an laufenden Bauteilen (visuell) als nächste Instanz nach PQB; Beauftragung von Bauteil-Messungen bei vermuteten Qualitätsabweichungen (zusätzlich zur 2-Stunden-Kontrolle der PQB)</w:t>
       </w:r>
     </w:p>
     <w:p>

</xml_diff>

<commit_message>
QS-Arbeitsliste: Grundsaetzliches-Abschnitt ergaenzt (Abgrenzung zu PQB)
Klärt die Grundcharakteristik: QS ist keine Serienfunktion fuer
wiederkehrende Pruefungen/Einzelfreigaben (PQB), sondern uebergeordnete
Q-Instanz.

Co-Authored-By: Claude Sonnet 5 <noreply@anthropic.com>
Claude-Session: https://claude.ai/code/session_01KTGUGVaPm39C5Y3H1dpETj
</commit_message>
<xml_diff>
--- a/working/QS_Rollenbeschreibung_Arbeitsentwurf.docx
+++ b/working/QS_Rollenbeschreibung_Arbeitsentwurf.docx
@@ -42,6 +42,68 @@
           <w:szCs w:val="18"/>
         </w:rPr>
         <w:t xml:space="preserve">Noch nicht Teil der Verfahrensanweisung 7V-5-1 — Basis für die Konsolidierung der QS-Rollenbeschreibung.</w:t>
+      </w:r>
+    </w:p>
+    <w:p>
+      <w:pPr>
+        <w:pStyle w:val="Heading2"/>
+        <w:spacing w:after="160" w:before="280"/>
+      </w:pPr>
+      <w:r>
+        <w:rPr>
+          <w:rFonts w:ascii="Calibri" w:cs="Calibri" w:eastAsia="Calibri" w:hAnsi="Calibri"/>
+          <w:b/>
+          <w:bCs/>
+        </w:rPr>
+        <w:t xml:space="preserve">Grundsätzliches</w:t>
+      </w:r>
+    </w:p>
+    <w:p>
+      <w:pPr>
+        <w:pStyle w:val="ListParagraph"/>
+        <w:numPr>
+          <w:ilvl w:val="0"/>
+          <w:numId w:val="2"/>
+        </w:numPr>
+        <w:spacing w:after="100"/>
+      </w:pPr>
+      <w:r>
+        <w:rPr>
+          <w:rFonts w:ascii="Calibri" w:cs="Calibri" w:eastAsia="Calibri" w:hAnsi="Calibri"/>
+        </w:rPr>
+        <w:t xml:space="preserve">QS ist keine Serienfunktion für wiederkehrende, zyklische Prüfungen — das ist Aufgabe der PQB</w:t>
+      </w:r>
+    </w:p>
+    <w:p>
+      <w:pPr>
+        <w:pStyle w:val="ListParagraph"/>
+        <w:numPr>
+          <w:ilvl w:val="0"/>
+          <w:numId w:val="2"/>
+        </w:numPr>
+        <w:spacing w:after="100"/>
+      </w:pPr>
+      <w:r>
+        <w:rPr>
+          <w:rFonts w:ascii="Calibri" w:cs="Calibri" w:eastAsia="Calibri" w:hAnsi="Calibri"/>
+        </w:rPr>
+        <w:t xml:space="preserve">QS ist auch nicht für die Freigabe einzelner Produktionsaufträge zuständig</w:t>
+      </w:r>
+    </w:p>
+    <w:p>
+      <w:pPr>
+        <w:pStyle w:val="ListParagraph"/>
+        <w:numPr>
+          <w:ilvl w:val="0"/>
+          <w:numId w:val="2"/>
+        </w:numPr>
+        <w:spacing w:after="100"/>
+      </w:pPr>
+      <w:r>
+        <w:rPr>
+          <w:rFonts w:ascii="Calibri" w:cs="Calibri" w:eastAsia="Calibri" w:hAnsi="Calibri"/>
+        </w:rPr>
+        <w:t xml:space="preserve">QS agiert als übergeordnete, weiter und umfassender erfahrene und geschulte Q-Instanz</w:t>
       </w:r>
     </w:p>
     <w:p>

</xml_diff>

<commit_message>
QS-Arbeitsliste: Punkt von AIDA ergaenzt (Freigabe bei SPAs/Sonderauftraegen anstelle PQB)
Co-Authored-By: Claude Sonnet 5 <noreply@anthropic.com>
Claude-Session: https://claude.ai/code/session_01KTGUGVaPm39C5Y3H1dpETj
</commit_message>
<xml_diff>
--- a/working/QS_Rollenbeschreibung_Arbeitsentwurf.docx
+++ b/working/QS_Rollenbeschreibung_Arbeitsentwurf.docx
@@ -630,6 +630,22 @@
           <w:rFonts w:ascii="Calibri" w:cs="Calibri" w:eastAsia="Calibri" w:hAnsi="Calibri"/>
         </w:rPr>
         <w:t xml:space="preserve">Stichprobenprüfung an laufenden Bauteilen (visuell) als nächste Instanz nach PQB; Beauftragung von Bauteil-Messungen bei vermuteten Qualitätsabweichungen (zusätzlich zur 2-Stunden-Kontrolle der PQB)</w:t>
+      </w:r>
+    </w:p>
+    <w:p>
+      <w:pPr>
+        <w:pStyle w:val="ListParagraph"/>
+        <w:numPr>
+          <w:ilvl w:val="0"/>
+          <w:numId w:val="2"/>
+        </w:numPr>
+        <w:spacing w:after="100"/>
+      </w:pPr>
+      <w:r>
+        <w:rPr>
+          <w:rFonts w:ascii="Calibri" w:cs="Calibri" w:eastAsia="Calibri" w:hAnsi="Calibri"/>
+        </w:rPr>
+        <w:t xml:space="preserve">Bei SPAs (Sonderaufträgen) und speziellen Aufträgen (z. B. FGAs): Freigabe im Zweifelsfall durch QS anstelle der PQB</w:t>
       </w:r>
     </w:p>
     <w:p>

</xml_diff>

<commit_message>
QS-Arbeitsliste: Punkt von AIDA ergaenzt (Anpassung Arbeitsanweisungen/Verpackungsvorschriften, Packversuche)
Co-Authored-By: Claude Sonnet 5 <noreply@anthropic.com>
Claude-Session: https://claude.ai/code/session_01KTGUGVaPm39C5Y3H1dpETj
</commit_message>
<xml_diff>
--- a/working/QS_Rollenbeschreibung_Arbeitsentwurf.docx
+++ b/working/QS_Rollenbeschreibung_Arbeitsentwurf.docx
@@ -646,6 +646,22 @@
           <w:rFonts w:ascii="Calibri" w:cs="Calibri" w:eastAsia="Calibri" w:hAnsi="Calibri"/>
         </w:rPr>
         <w:t xml:space="preserve">Bei SPAs (Sonderaufträgen) und speziellen Aufträgen (z. B. FGAs): Freigabe im Zweifelsfall durch QS anstelle der PQB</w:t>
+      </w:r>
+    </w:p>
+    <w:p>
+      <w:pPr>
+        <w:pStyle w:val="ListParagraph"/>
+        <w:numPr>
+          <w:ilvl w:val="0"/>
+          <w:numId w:val="2"/>
+        </w:numPr>
+        <w:spacing w:after="100"/>
+      </w:pPr>
+      <w:r>
+        <w:rPr>
+          <w:rFonts w:ascii="Calibri" w:cs="Calibri" w:eastAsia="Calibri" w:hAnsi="Calibri"/>
+        </w:rPr>
+        <w:t xml:space="preserve">Anstoß zur Anpassung von Arbeitsanweisungen und Verpackungsvorschriften; Durchführung von Packversuchen und Erarbeitung von Arbeitsabläufen inkl. Hilfsmittel/Ausstattung in Zusammenarbeit mit Projekttechnik und Verpackungsmanagement</w:t>
       </w:r>
     </w:p>
     <w:p>

</xml_diff>

<commit_message>
Stellen-/Rollenbeschreibungen: Herkunfts-/Ableitungs-Details aus Untertiteln entfernt
Betrifft Produktionskoordination-Stellenbeschreibung ("Behandelt
ausschließlich die Vertretungsfunktion..."), QS-Stellenbeschreibung
("Basis: konsolidierte Rollenbeschreibung inkl. Ergänzungen von AIDA")
und QS-Rollenbeschreibung ("Review/Ergänzung gemeinsam mit AIDA" /
"Basis für die Konsolidierung der QS-Rollenbeschreibung"). Eine
Stellenbeschreibung beschreibt die Rolle, nicht wie das Dokument
entstanden ist - einheitlicher Untertitel jetzt nur noch "Arbeitsentwurf.
Noch nicht Teil der Verfahrensanweisung 7V-5-1." (Rollenbeschreibungen:
zusätzlich "Arbeitsentwurf zum Ausdrucken"). Inhaltliche Scope-Aussagen,
die bereits im Dokumentkörper selbst stehen (z. B. "Keine
Teamleitungsfunktion..."), bleiben dort unverändert bestehen.

Co-Authored-By: Claude Sonnet 5 <noreply@anthropic.com>
Claude-Session: https://claude.ai/code/session_01DYu9Jmx4EF5jDapuJDs8ut
</commit_message>
<xml_diff>
--- a/working/QS_Rollenbeschreibung_Arbeitsentwurf.docx
+++ b/working/QS_Rollenbeschreibung_Arbeitsentwurf.docx
@@ -26,7 +26,7 @@
           <w:sz w:val="20"/>
           <w:szCs w:val="20"/>
         </w:rPr>
-        <w:t xml:space="preserve">Arbeitsentwurf zum Ausdrucken — Review/Ergänzung gemeinsam mit AIDA</w:t>
+        <w:t xml:space="preserve">Arbeitsentwurf zum Ausdrucken</w:t>
       </w:r>
     </w:p>
     <w:p>
@@ -41,7 +41,7 @@
           <w:sz w:val="18"/>
           <w:szCs w:val="18"/>
         </w:rPr>
-        <w:t xml:space="preserve">Noch nicht Teil der Verfahrensanweisung 7V-5-1 — Basis für die Konsolidierung der QS-Rollenbeschreibung.</w:t>
+        <w:t xml:space="preserve">Noch nicht Teil der Verfahrensanweisung 7V-5-1.</w:t>
       </w:r>
     </w:p>
     <w:p>

</xml_diff>